<commit_message>
fix(md_to_docx): render *italic* too, and assert no markdown asterisks survive into the Word copy
</commit_message>
<xml_diff>
--- a/docs/case-study-hkbu.docx
+++ b/docs/case-study-hkbu.docx
@@ -20,7 +20,10 @@
     </w:p>
     <w:p>
       <w:r>
-        <w:t xml:space="preserve">*Xinrui Shao · case study · 2026*</w:t>
+        <w:rPr>
+          <w:i/>
+        </w:rPr>
+        <w:t xml:space="preserve">Xinrui Shao · case study · 2026</w:t>
       </w:r>
     </w:p>
     <w:p>
@@ -33,7 +36,16 @@
     </w:p>
     <w:p>
       <w:r>
-        <w:t xml:space="preserve">I produced *Demon*, a ~20-minute narrative short generated with a text-to-video model across 18 scenes</w:t>
+        <w:t xml:space="preserve">I produced </w:t>
+      </w:r>
+      <w:r>
+        <w:rPr>
+          <w:i/>
+        </w:rPr>
+        <w:t xml:space="preserve">Demon</w:t>
+      </w:r>
+      <w:r>
+        <w:t xml:space="preserve">, a ~20-minute narrative short generated with a text-to-video model across 18 scenes</w:t>
       </w:r>
     </w:p>
     <w:p>
@@ -828,7 +840,16 @@
         <w:t xml:space="preserve">Links.</w:t>
       </w:r>
       <w:r>
-        <w:t xml:space="preserve"> Repository: `&lt;repo link&gt;` · 60-second walkthrough: `&lt;video link&gt;` · Film: *Demon* (2026)</w:t>
+        <w:t xml:space="preserve"> Repository: `&lt;repo link&gt;` · 60-second walkthrough: `&lt;video link&gt;` · Film: </w:t>
+      </w:r>
+      <w:r>
+        <w:rPr>
+          <w:i/>
+        </w:rPr>
+        <w:t xml:space="preserve">Demon</w:t>
+      </w:r>
+      <w:r>
+        <w:t xml:space="preserve"> (2026)</w:t>
       </w:r>
     </w:p>
     <w:sectPr>

</xml_diff>

<commit_message>
docs: verification count 25 → 27 across all submission docs (number must match make verify)
</commit_message>
<xml_diff>
--- a/docs/case-study-hkbu.docx
+++ b/docs/case-study-hkbu.docx
@@ -444,7 +444,7 @@
         <w:t xml:space="preserve">Verification.</w:t>
       </w:r>
       <w:r>
-        <w:t xml:space="preserve"> `make verify` runs 25 checks: synthetic-docx parsing, character extraction across</w:t>
+        <w:t xml:space="preserve"> `make verify` runs 27 checks: synthetic-docx parsing, character extraction across</w:t>
       </w:r>
     </w:p>
     <w:p>
@@ -586,7 +586,7 @@
           </w:tcPr>
           <w:p>
             <w:r>
-              <w:t xml:space="preserve">25 (`make verify`)</w:t>
+              <w:t xml:space="preserve">27 (`make verify`)</w:t>
             </w:r>
           </w:p>
         </w:tc>
@@ -781,7 +781,7 @@
         <w:t xml:space="preserve">Ad-hoc verification.</w:t>
       </w:r>
       <w:r>
-        <w:t xml:space="preserve"> 25 checks, not a suite; failure modes in the parsers' degenerate inputs are</w:t>
+        <w:t xml:space="preserve"> 27 checks, not a suite; failure modes in the parsers' degenerate inputs are</w:t>
       </w:r>
     </w:p>
     <w:p>

</xml_diff>

<commit_message>
feat(example): fictional asset document (11 prompts) + README demo/example sections; docx image support in use
</commit_message>
<xml_diff>
--- a/docs/case-study-hkbu.docx
+++ b/docs/case-study-hkbu.docx
@@ -1,6 +1,6 @@
 
 <file path=word/document.xml><?xml version="1.0" encoding="utf-8"?>
-<w:document xmlns:w="http://schemas.openxmlformats.org/wordprocessingml/2006/main">
+<w:document xmlns:w="http://schemas.openxmlformats.org/wordprocessingml/2006/main" xmlns:r="http://schemas.openxmlformats.org/officeDocument/2006/relationships" xmlns:wp="http://schemas.openxmlformats.org/drawingml/2006/wordprocessingDrawing" xmlns:a="http://schemas.openxmlformats.org/drawingml/2006/main" xmlns:pic="http://schemas.openxmlformats.org/drawingml/2006/picture">
   <w:body>
     <w:p>
       <w:pPr>
@@ -463,6 +463,26 @@
       </w:r>
     </w:p>
     <w:p>
+      <w:r>
+        <w:t xml:space="preserve">![Figure 1 — the prompt linter on a shot as first written: 11 defects, each with the rewritten line,</w:t>
+      </w:r>
+    </w:p>
+    <w:p>
+      <w:r>
+        <w:t xml:space="preserve">then the same shot clean.](figures/fig1-prompt-lint-before-after.png)</w:t>
+      </w:r>
+    </w:p>
+    <w:p>
+      <w:r>
+        <w:t xml:space="preserve">![Figure 2 — `make verify`: 27 checks over the parsers, the linter, the document writer and the take</w:t>
+      </w:r>
+    </w:p>
+    <w:p>
+      <w:r>
+        <w:t xml:space="preserve">log; exit 0.](figures/fig3-verification.png)</w:t>
+      </w:r>
+    </w:p>
+    <w:p>
       <w:pPr>
         <w:pStyle w:val="Heading2"/>
       </w:pPr>
@@ -693,6 +713,16 @@
     <w:p>
       <w:r>
         <w:t xml:space="preserve">the next improvement should be a rewritten clause, a different shot design, or a new plate.</w:t>
+      </w:r>
+    </w:p>
+    <w:p>
+      <w:r>
+        <w:t xml:space="preserve">![Figure 3 — the take log after four takes: rework rounds, the failure types that cost them, and the</w:t>
+      </w:r>
+    </w:p>
+    <w:p>
+      <w:r>
+        <w:t xml:space="preserve">attribution that decides the fix.](figures/fig2-rework-accounting.png)</w:t>
       </w:r>
     </w:p>
     <w:p>

</xml_diff>

<commit_message>
fix(md_to_docx): join soft-wrapped image markup too — figures now embed in every doc
</commit_message>
<xml_diff>
--- a/docs/case-study-hkbu.docx
+++ b/docs/case-study-hkbu.docx
@@ -464,22 +464,90 @@
     </w:p>
     <w:p>
       <w:r>
-        <w:t xml:space="preserve">![Figure 1 — the prompt linter on a shot as first written: 11 defects, each with the rewritten line,</w:t>
-      </w:r>
-    </w:p>
-    <w:p>
-      <w:r>
-        <w:t xml:space="preserve">then the same shot clean.](figures/fig1-prompt-lint-before-after.png)</w:t>
-      </w:r>
-    </w:p>
-    <w:p>
-      <w:r>
-        <w:t xml:space="preserve">![Figure 2 — `make verify`: 27 checks over the parsers, the linter, the document writer and the take</w:t>
-      </w:r>
-    </w:p>
-    <w:p>
-      <w:r>
-        <w:t xml:space="preserve">log; exit 0.](figures/fig3-verification.png)</w:t>
+        <w:drawing>
+          <wp:inline distT="0" distB="0" distL="0" distR="0">
+            <wp:extent cx="5700000" cy="2818828"/>
+            <wp:docPr id="1" name="Figure1"/>
+            <wp:cNvGraphicFramePr/>
+            <a:graphic>
+              <a:graphicData uri="http://schemas.openxmlformats.org/drawingml/2006/picture">
+                <pic:pic>
+                  <pic:nvPicPr>
+                    <pic:cNvPr id="1" name="Figure1"/>
+                    <pic:cNvPicPr/>
+                  </pic:nvPicPr>
+                  <pic:blipFill>
+                    <a:blip r:embed="rIdImg1"/>
+                    <a:stretch>
+                      <a:fillRect/>
+                    </a:stretch>
+                  </pic:blipFill>
+                  <pic:spPr>
+                    <a:xfrm>
+                      <a:off x="0" y="0"/>
+                      <a:ext cx="5700000" cy="2818828"/>
+                    </a:xfrm>
+                    <a:prstGeom prst="rect">
+                      <a:avLst/>
+                    </a:prstGeom>
+                  </pic:spPr>
+                </pic:pic>
+              </a:graphicData>
+            </a:graphic>
+          </wp:inline>
+        </w:drawing>
+      </w:r>
+    </w:p>
+    <w:p>
+      <w:pPr>
+        <w:pStyle w:val="Quote"/>
+      </w:pPr>
+      <w:r>
+        <w:t xml:space="preserve">Figure 1 — the prompt linter on a shot as first written: 11 defects, each with the rewritten line, then the same shot clean.</w:t>
+      </w:r>
+    </w:p>
+    <w:p>
+      <w:r>
+        <w:drawing>
+          <wp:inline distT="0" distB="0" distL="0" distR="0">
+            <wp:extent cx="5700000" cy="2818828"/>
+            <wp:docPr id="2" name="Figure2"/>
+            <wp:cNvGraphicFramePr/>
+            <a:graphic>
+              <a:graphicData uri="http://schemas.openxmlformats.org/drawingml/2006/picture">
+                <pic:pic>
+                  <pic:nvPicPr>
+                    <pic:cNvPr id="2" name="Figure2"/>
+                    <pic:cNvPicPr/>
+                  </pic:nvPicPr>
+                  <pic:blipFill>
+                    <a:blip r:embed="rIdImg2"/>
+                    <a:stretch>
+                      <a:fillRect/>
+                    </a:stretch>
+                  </pic:blipFill>
+                  <pic:spPr>
+                    <a:xfrm>
+                      <a:off x="0" y="0"/>
+                      <a:ext cx="5700000" cy="2818828"/>
+                    </a:xfrm>
+                    <a:prstGeom prst="rect">
+                      <a:avLst/>
+                    </a:prstGeom>
+                  </pic:spPr>
+                </pic:pic>
+              </a:graphicData>
+            </a:graphic>
+          </wp:inline>
+        </w:drawing>
+      </w:r>
+    </w:p>
+    <w:p>
+      <w:pPr>
+        <w:pStyle w:val="Quote"/>
+      </w:pPr>
+      <w:r>
+        <w:t xml:space="preserve">Figure 2 — `make verify`: 27 checks over the parsers, the linter, the document writer and the take log; exit 0.</w:t>
       </w:r>
     </w:p>
     <w:p>
@@ -717,12 +785,46 @@
     </w:p>
     <w:p>
       <w:r>
-        <w:t xml:space="preserve">![Figure 3 — the take log after four takes: rework rounds, the failure types that cost them, and the</w:t>
-      </w:r>
-    </w:p>
-    <w:p>
-      <w:r>
-        <w:t xml:space="preserve">attribution that decides the fix.](figures/fig2-rework-accounting.png)</w:t>
+        <w:drawing>
+          <wp:inline distT="0" distB="0" distL="0" distR="0">
+            <wp:extent cx="5700000" cy="2818828"/>
+            <wp:docPr id="3" name="Figure3"/>
+            <wp:cNvGraphicFramePr/>
+            <a:graphic>
+              <a:graphicData uri="http://schemas.openxmlformats.org/drawingml/2006/picture">
+                <pic:pic>
+                  <pic:nvPicPr>
+                    <pic:cNvPr id="3" name="Figure3"/>
+                    <pic:cNvPicPr/>
+                  </pic:nvPicPr>
+                  <pic:blipFill>
+                    <a:blip r:embed="rIdImg3"/>
+                    <a:stretch>
+                      <a:fillRect/>
+                    </a:stretch>
+                  </pic:blipFill>
+                  <pic:spPr>
+                    <a:xfrm>
+                      <a:off x="0" y="0"/>
+                      <a:ext cx="5700000" cy="2818828"/>
+                    </a:xfrm>
+                    <a:prstGeom prst="rect">
+                      <a:avLst/>
+                    </a:prstGeom>
+                  </pic:spPr>
+                </pic:pic>
+              </a:graphicData>
+            </a:graphic>
+          </wp:inline>
+        </w:drawing>
+      </w:r>
+    </w:p>
+    <w:p>
+      <w:pPr>
+        <w:pStyle w:val="Quote"/>
+      </w:pPr>
+      <w:r>
+        <w:t xml:space="preserve">Figure 3 — the take log after four takes: rework rounds, the failure types that cost them, and the attribution that decides the fix.</w:t>
       </w:r>
     </w:p>
     <w:p>

</xml_diff>